<commit_message>
10/21 F2: bible rebuilt on the producer's uploaded tease and A opening (verbatim up to Lon's old intro), Lon after the A clips; outline Doc tables finished from Lon's beat down
Co-Authored-By: Claude Opus 5.5 <noreply@anthropic.com>
Claude-Session: https://claude.ai/code/session_01VmRatYBunsoj9i1F4m2msf
</commit_message>
<xml_diff>
--- a/runs/W_10212026/Outline F2 10_21.docx
+++ b/runs/W_10212026/Outline F2 10_21.docx
@@ -716,16 +716,7 @@
         <w:spacing w:after="40"/>
       </w:pPr>
       <w:r>
-        <w:t>A is thin on people: A2 to A4 are a creator, a state and a researcher. Lon is the human in A.</w:t>
-      </w:r>
-    </w:p>
-    <w:p>
-      <w:pPr>
-        <w:pStyle w:val="ListBullet"/>
-        <w:spacing w:after="40"/>
-      </w:pPr>
-      <w:r>
-        <w:t>Lon comes in after all three A clips (producer, 10/14), with a full expert block: mechanics, his read of the Texas deal (he argued on Lon.TV that it let LG off the hook), the listening claim, the settings, and four numbered questions.</w:t>
+        <w:t>A is thin on people: A2 to A4 are a creator, a state and a researcher. Lon is the human in A. Lon comes in after all three A clips (producer, 10/14), with a full expert block: mechanics, his read of the Texas deal (he argued on Lon.TV that it let LG off the hook), the listening claim, the settings, and four numbered questions.</w:t>
       </w:r>
     </w:p>
     <w:p>
@@ -1013,7 +1004,7 @@
               <w:rPr>
                 <w:sz w:val="19"/>
               </w:rPr>
-              <w:t>Every show you watch, even a DVD or a cable box, your smart TV checks what's on the screen and matches it (ACR).</w:t>
+              <w:t>Every show you watch, even a DVD or a cable box, your smart TV checks what's on the screen.</w:t>
             </w:r>
           </w:p>
         </w:tc>

</xml_diff>